<commit_message>
docs: snapshot budget update, SFC email draft, and legacy prompt copy
Rollback point before drafting the Commons-Hub doc split. budget.docx has
pending edits; Untitled and prompt.txt are working artifacts (earlier SFC
outreach draft, superseded bootstrap-phase spec) preserved as-is rather than
discarded.

Co-Authored-By: Claude Sonnet 5 <noreply@anthropic.com>
</commit_message>
<xml_diff>
--- a/fiscal-sponsorship/budget.docx
+++ b/fiscal-sponsorship/budget.docx
@@ -103,7 +103,6 @@
         <w:keepLines w:val="false"/>
         <w:pageBreakBefore w:val="false"/>
         <w:widowControl/>
-        <w:pBdr/>
         <w:shd w:val="clear" w:fill="auto"/>
         <w:spacing w:lineRule="auto" w:line="264" w:before="0" w:after="160"/>
         <w:ind w:hanging="0" w:start="0" w:end="0"/>
@@ -156,7 +155,6 @@
       <w:pPr>
         <w:pStyle w:val="normal1"/>
         <w:widowControl w:val="false"/>
-        <w:pBdr/>
         <w:spacing w:lineRule="auto" w:line="250" w:before="126" w:after="160"/>
         <w:ind w:end="247"/>
         <w:jc w:val="both"/>
@@ -179,7 +177,6 @@
       <w:pPr>
         <w:pStyle w:val="normal1"/>
         <w:widowControl w:val="false"/>
-        <w:pBdr/>
         <w:spacing w:lineRule="auto" w:line="250" w:before="126" w:after="160"/>
         <w:ind w:end="247"/>
         <w:jc w:val="both"/>
@@ -219,7 +216,6 @@
       <w:pPr>
         <w:pStyle w:val="normal1"/>
         <w:widowControl w:val="false"/>
-        <w:pBdr/>
         <w:spacing w:lineRule="auto" w:line="250" w:before="126" w:after="160"/>
         <w:ind w:end="247"/>
         <w:jc w:val="both"/>
@@ -272,7 +268,6 @@
               <w:keepNext w:val="false"/>
               <w:keepLines w:val="false"/>
               <w:widowControl/>
-              <w:pBdr/>
               <w:shd w:val="clear" w:fill="auto"/>
               <w:spacing w:lineRule="auto" w:line="240" w:before="120" w:after="120"/>
               <w:ind w:hanging="0" w:start="0" w:end="0"/>
@@ -314,7 +309,6 @@
               <w:keepNext w:val="false"/>
               <w:keepLines w:val="false"/>
               <w:widowControl/>
-              <w:pBdr/>
               <w:shd w:val="clear" w:fill="auto"/>
               <w:spacing w:lineRule="auto" w:line="240" w:before="120" w:after="120"/>
               <w:ind w:hanging="0" w:start="0" w:end="0"/>
@@ -358,7 +352,6 @@
               <w:keepNext w:val="false"/>
               <w:keepLines w:val="false"/>
               <w:widowControl/>
-              <w:pBdr/>
               <w:shd w:val="clear" w:fill="auto"/>
               <w:spacing w:lineRule="auto" w:line="240" w:before="120" w:after="120"/>
               <w:ind w:hanging="0" w:start="0" w:end="0"/>
@@ -400,7 +393,6 @@
               <w:keepNext w:val="false"/>
               <w:keepLines w:val="false"/>
               <w:widowControl/>
-              <w:pBdr/>
               <w:shd w:val="clear" w:fill="auto"/>
               <w:spacing w:lineRule="auto" w:line="240" w:before="120" w:after="120"/>
               <w:ind w:hanging="0" w:start="0" w:end="0"/>
@@ -493,7 +485,6 @@
               <w:keepNext w:val="false"/>
               <w:keepLines w:val="false"/>
               <w:widowControl/>
-              <w:pBdr/>
               <w:shd w:val="clear" w:fill="auto"/>
               <w:spacing w:lineRule="auto" w:line="240" w:before="120" w:after="120"/>
               <w:ind w:hanging="0" w:start="0" w:end="0"/>
@@ -535,7 +526,6 @@
               <w:keepNext w:val="false"/>
               <w:keepLines w:val="false"/>
               <w:widowControl/>
-              <w:pBdr/>
               <w:shd w:val="clear" w:fill="auto"/>
               <w:spacing w:lineRule="auto" w:line="240" w:before="120" w:after="120"/>
               <w:ind w:hanging="0" w:start="0" w:end="0"/>
@@ -579,7 +569,6 @@
               <w:keepNext w:val="false"/>
               <w:keepLines w:val="false"/>
               <w:widowControl/>
-              <w:pBdr/>
               <w:shd w:val="clear" w:fill="auto"/>
               <w:spacing w:lineRule="auto" w:line="240" w:before="120" w:after="120"/>
               <w:ind w:hanging="0" w:start="0" w:end="0"/>
@@ -621,7 +610,6 @@
               <w:keepNext w:val="false"/>
               <w:keepLines w:val="false"/>
               <w:widowControl/>
-              <w:pBdr/>
               <w:shd w:val="clear" w:fill="auto"/>
               <w:spacing w:lineRule="auto" w:line="240" w:before="120" w:after="120"/>
               <w:ind w:hanging="0" w:start="0" w:end="0"/>
@@ -695,10 +683,10 @@
       </w:pPr>
       <w:r>
         <w:rPr>
-          <w:b/>
-          <w:bCs/>
-          <w:sz w:val="24"/>
-          <w:szCs w:val="24"/>
+          <w:rFonts w:eastAsia="Arial" w:cs="Arial" w:ascii="Arial" w:hAnsi="Arial"/>
+          <w:color w:val="000000"/>
+          <w:sz w:val="20"/>
+          <w:szCs w:val="20"/>
         </w:rPr>
       </w:r>
     </w:p>
@@ -851,7 +839,7 @@
       <w:tblPr>
         <w:tblW w:w="7823" w:type="dxa"/>
         <w:jc w:val="start"/>
-        <w:tblInd w:w="-7" w:type="dxa"/>
+        <w:tblInd w:w="-6" w:type="dxa"/>
         <w:tblLayout w:type="fixed"/>
         <w:tblCellMar>
           <w:top w:w="90" w:type="dxa"/>
@@ -1128,7 +1116,7 @@
                 <w:sz w:val="20"/>
                 <w:szCs w:val="20"/>
               </w:rPr>
-              <w:t>Microsoft 365 Spike (Personnel)</w:t>
+              <w:t xml:space="preserve">Non-google Alternatives </w:t>
             </w:r>
           </w:p>
         </w:tc>
@@ -1364,6 +1352,1184 @@
     <w:p>
       <w:pPr>
         <w:pStyle w:val="Heading2"/>
+        <w:spacing w:before="0" w:after="80"/>
+        <w:rPr/>
+      </w:pPr>
+      <w:r>
+        <w:rPr/>
+        <w:t>Operational Expenses Detail (non-personnel) — 4-month budget period (Sept-Dec)</w:t>
+      </w:r>
+    </w:p>
+    <w:p>
+      <w:pPr>
+        <w:pStyle w:val="BodyText"/>
+        <w:rPr>
+          <w:i/>
+        </w:rPr>
+      </w:pPr>
+      <w:r>
+        <w:rPr>
+          <w:i/>
+        </w:rPr>
+        <w:t>Recalculated for an approx 3-month project duration (September-December). Allocation % reflects the portion of each mixed personal/program-use expense charged to this Fund. Annual/one-time items are prorated at 4/12 of their yearly allocated amount.</w:t>
+      </w:r>
+    </w:p>
+    <w:tbl>
+      <w:tblPr>
+        <w:tblW w:w="10205" w:type="dxa"/>
+        <w:jc w:val="start"/>
+        <w:tblInd w:w="-6" w:type="dxa"/>
+        <w:tblLayout w:type="fixed"/>
+        <w:tblCellMar>
+          <w:top w:w="90" w:type="dxa"/>
+          <w:start w:w="90" w:type="dxa"/>
+          <w:bottom w:w="90" w:type="dxa"/>
+          <w:end w:w="90" w:type="dxa"/>
+        </w:tblCellMar>
+      </w:tblPr>
+      <w:tblGrid>
+        <w:gridCol w:w="5900"/>
+        <w:gridCol w:w="1222"/>
+        <w:gridCol w:w="1254"/>
+        <w:gridCol w:w="1829"/>
+      </w:tblGrid>
+      <w:tr>
+        <w:trPr/>
+        <w:tc>
+          <w:tcPr>
+            <w:tcW w:w="5900" w:type="dxa"/>
+            <w:tcBorders>
+              <w:top w:val="single" w:sz="6" w:space="0" w:color="808080"/>
+              <w:start w:val="single" w:sz="6" w:space="0" w:color="808080"/>
+              <w:bottom w:val="single" w:sz="2" w:space="0" w:color="808080"/>
+              <w:end w:val="single" w:sz="6" w:space="0" w:color="808080"/>
+            </w:tcBorders>
+            <w:vAlign w:val="center"/>
+          </w:tcPr>
+          <w:p>
+            <w:pPr>
+              <w:pStyle w:val="TableHeading2"/>
+              <w:spacing w:before="0" w:after="140"/>
+              <w:rPr/>
+            </w:pPr>
+            <w:r>
+              <w:rPr/>
+              <w:t>Item</w:t>
+            </w:r>
+          </w:p>
+        </w:tc>
+        <w:tc>
+          <w:tcPr>
+            <w:tcW w:w="1222" w:type="dxa"/>
+            <w:tcBorders>
+              <w:top w:val="single" w:sz="6" w:space="0" w:color="808080"/>
+              <w:start w:val="single" w:sz="2" w:space="0" w:color="808080"/>
+              <w:bottom w:val="single" w:sz="2" w:space="0" w:color="808080"/>
+              <w:end w:val="single" w:sz="6" w:space="0" w:color="808080"/>
+            </w:tcBorders>
+            <w:vAlign w:val="center"/>
+          </w:tcPr>
+          <w:p>
+            <w:pPr>
+              <w:pStyle w:val="TableHeading2"/>
+              <w:spacing w:before="0" w:after="140"/>
+              <w:rPr/>
+            </w:pPr>
+            <w:r>
+              <w:rPr/>
+              <w:t>Basis</w:t>
+            </w:r>
+          </w:p>
+        </w:tc>
+        <w:tc>
+          <w:tcPr>
+            <w:tcW w:w="1254" w:type="dxa"/>
+            <w:tcBorders>
+              <w:top w:val="single" w:sz="6" w:space="0" w:color="808080"/>
+              <w:start w:val="single" w:sz="2" w:space="0" w:color="808080"/>
+              <w:bottom w:val="single" w:sz="2" w:space="0" w:color="808080"/>
+              <w:end w:val="single" w:sz="6" w:space="0" w:color="808080"/>
+            </w:tcBorders>
+            <w:vAlign w:val="center"/>
+          </w:tcPr>
+          <w:p>
+            <w:pPr>
+              <w:pStyle w:val="TableHeading2"/>
+              <w:spacing w:before="0" w:after="140"/>
+              <w:rPr/>
+            </w:pPr>
+            <w:r>
+              <w:rPr/>
+              <w:t>Allocation</w:t>
+            </w:r>
+          </w:p>
+        </w:tc>
+        <w:tc>
+          <w:tcPr>
+            <w:tcW w:w="1829" w:type="dxa"/>
+            <w:tcBorders>
+              <w:top w:val="single" w:sz="6" w:space="0" w:color="808080"/>
+              <w:start w:val="single" w:sz="2" w:space="0" w:color="808080"/>
+              <w:bottom w:val="single" w:sz="2" w:space="0" w:color="808080"/>
+              <w:end w:val="single" w:sz="6" w:space="0" w:color="808080"/>
+            </w:tcBorders>
+            <w:vAlign w:val="center"/>
+          </w:tcPr>
+          <w:p>
+            <w:pPr>
+              <w:pStyle w:val="TableHeading2"/>
+              <w:spacing w:before="0" w:after="140"/>
+              <w:rPr/>
+            </w:pPr>
+            <w:r>
+              <w:rPr/>
+              <w:t>Amount (3 mo. / total)</w:t>
+            </w:r>
+          </w:p>
+        </w:tc>
+      </w:tr>
+      <w:tr>
+        <w:trPr/>
+        <w:tc>
+          <w:tcPr>
+            <w:tcW w:w="5900" w:type="dxa"/>
+            <w:tcBorders>
+              <w:start w:val="single" w:sz="6" w:space="0" w:color="808080"/>
+              <w:bottom w:val="single" w:sz="2" w:space="0" w:color="808080"/>
+              <w:end w:val="single" w:sz="6" w:space="0" w:color="808080"/>
+            </w:tcBorders>
+            <w:vAlign w:val="center"/>
+          </w:tcPr>
+          <w:p>
+            <w:pPr>
+              <w:pStyle w:val="TableContents"/>
+              <w:spacing w:before="0" w:after="140"/>
+              <w:rPr/>
+            </w:pPr>
+            <w:r>
+              <w:rPr/>
+              <w:t>Cloud hosting (DigitalOcean)</w:t>
+            </w:r>
+          </w:p>
+        </w:tc>
+        <w:tc>
+          <w:tcPr>
+            <w:tcW w:w="1222" w:type="dxa"/>
+            <w:tcBorders>
+              <w:start w:val="single" w:sz="2" w:space="0" w:color="808080"/>
+              <w:bottom w:val="single" w:sz="2" w:space="0" w:color="808080"/>
+              <w:end w:val="single" w:sz="6" w:space="0" w:color="808080"/>
+            </w:tcBorders>
+            <w:vAlign w:val="center"/>
+          </w:tcPr>
+          <w:p>
+            <w:pPr>
+              <w:pStyle w:val="TableContents"/>
+              <w:spacing w:before="0" w:after="140"/>
+              <w:rPr/>
+            </w:pPr>
+            <w:r>
+              <w:rPr/>
+              <w:t>$30/mo</w:t>
+            </w:r>
+          </w:p>
+        </w:tc>
+        <w:tc>
+          <w:tcPr>
+            <w:tcW w:w="1254" w:type="dxa"/>
+            <w:tcBorders>
+              <w:start w:val="single" w:sz="2" w:space="0" w:color="808080"/>
+              <w:bottom w:val="single" w:sz="2" w:space="0" w:color="808080"/>
+              <w:end w:val="single" w:sz="6" w:space="0" w:color="808080"/>
+            </w:tcBorders>
+            <w:vAlign w:val="center"/>
+          </w:tcPr>
+          <w:p>
+            <w:pPr>
+              <w:pStyle w:val="TableContents"/>
+              <w:spacing w:before="0" w:after="140"/>
+              <w:rPr/>
+            </w:pPr>
+            <w:r>
+              <w:rPr/>
+              <w:t>50%</w:t>
+            </w:r>
+          </w:p>
+        </w:tc>
+        <w:tc>
+          <w:tcPr>
+            <w:tcW w:w="1829" w:type="dxa"/>
+            <w:tcBorders>
+              <w:start w:val="single" w:sz="2" w:space="0" w:color="808080"/>
+              <w:bottom w:val="single" w:sz="2" w:space="0" w:color="808080"/>
+              <w:end w:val="single" w:sz="6" w:space="0" w:color="808080"/>
+            </w:tcBorders>
+            <w:vAlign w:val="center"/>
+          </w:tcPr>
+          <w:p>
+            <w:pPr>
+              <w:pStyle w:val="TableContents"/>
+              <w:spacing w:before="0" w:after="140"/>
+              <w:rPr/>
+            </w:pPr>
+            <w:r>
+              <w:rPr/>
+              <w:t>$60.00</w:t>
+            </w:r>
+          </w:p>
+        </w:tc>
+      </w:tr>
+      <w:tr>
+        <w:trPr/>
+        <w:tc>
+          <w:tcPr>
+            <w:tcW w:w="5900" w:type="dxa"/>
+            <w:tcBorders>
+              <w:start w:val="single" w:sz="6" w:space="0" w:color="808080"/>
+              <w:bottom w:val="single" w:sz="2" w:space="0" w:color="808080"/>
+              <w:end w:val="single" w:sz="6" w:space="0" w:color="808080"/>
+            </w:tcBorders>
+            <w:vAlign w:val="center"/>
+          </w:tcPr>
+          <w:p>
+            <w:pPr>
+              <w:pStyle w:val="TableContents"/>
+              <w:spacing w:before="0" w:after="140"/>
+              <w:rPr/>
+            </w:pPr>
+            <w:r>
+              <w:rPr/>
+              <w:t>Dev tooling (GitHub)</w:t>
+            </w:r>
+          </w:p>
+        </w:tc>
+        <w:tc>
+          <w:tcPr>
+            <w:tcW w:w="1222" w:type="dxa"/>
+            <w:tcBorders>
+              <w:start w:val="single" w:sz="2" w:space="0" w:color="808080"/>
+              <w:bottom w:val="single" w:sz="2" w:space="0" w:color="808080"/>
+              <w:end w:val="single" w:sz="6" w:space="0" w:color="808080"/>
+            </w:tcBorders>
+            <w:vAlign w:val="center"/>
+          </w:tcPr>
+          <w:p>
+            <w:pPr>
+              <w:pStyle w:val="TableContents"/>
+              <w:spacing w:before="0" w:after="140"/>
+              <w:rPr/>
+            </w:pPr>
+            <w:r>
+              <w:rPr/>
+              <w:t>$10/mo</w:t>
+            </w:r>
+          </w:p>
+        </w:tc>
+        <w:tc>
+          <w:tcPr>
+            <w:tcW w:w="1254" w:type="dxa"/>
+            <w:tcBorders>
+              <w:start w:val="single" w:sz="2" w:space="0" w:color="808080"/>
+              <w:bottom w:val="single" w:sz="2" w:space="0" w:color="808080"/>
+              <w:end w:val="single" w:sz="6" w:space="0" w:color="808080"/>
+            </w:tcBorders>
+            <w:vAlign w:val="center"/>
+          </w:tcPr>
+          <w:p>
+            <w:pPr>
+              <w:pStyle w:val="TableContents"/>
+              <w:spacing w:before="0" w:after="140"/>
+              <w:rPr/>
+            </w:pPr>
+            <w:r>
+              <w:rPr/>
+              <w:t>50%</w:t>
+            </w:r>
+          </w:p>
+        </w:tc>
+        <w:tc>
+          <w:tcPr>
+            <w:tcW w:w="1829" w:type="dxa"/>
+            <w:tcBorders>
+              <w:start w:val="single" w:sz="2" w:space="0" w:color="808080"/>
+              <w:bottom w:val="single" w:sz="2" w:space="0" w:color="808080"/>
+              <w:end w:val="single" w:sz="6" w:space="0" w:color="808080"/>
+            </w:tcBorders>
+            <w:vAlign w:val="center"/>
+          </w:tcPr>
+          <w:p>
+            <w:pPr>
+              <w:pStyle w:val="TableContents"/>
+              <w:spacing w:before="0" w:after="140"/>
+              <w:rPr/>
+            </w:pPr>
+            <w:r>
+              <w:rPr/>
+              <w:t>$20.00</w:t>
+            </w:r>
+          </w:p>
+        </w:tc>
+      </w:tr>
+      <w:tr>
+        <w:trPr/>
+        <w:tc>
+          <w:tcPr>
+            <w:tcW w:w="5900" w:type="dxa"/>
+            <w:tcBorders>
+              <w:start w:val="single" w:sz="6" w:space="0" w:color="808080"/>
+              <w:bottom w:val="single" w:sz="2" w:space="0" w:color="808080"/>
+              <w:end w:val="single" w:sz="6" w:space="0" w:color="808080"/>
+            </w:tcBorders>
+            <w:vAlign w:val="center"/>
+          </w:tcPr>
+          <w:p>
+            <w:pPr>
+              <w:pStyle w:val="TableContents"/>
+              <w:spacing w:before="0" w:after="140"/>
+              <w:rPr/>
+            </w:pPr>
+            <w:r>
+              <w:rPr/>
+              <w:t>Internet</w:t>
+            </w:r>
+          </w:p>
+        </w:tc>
+        <w:tc>
+          <w:tcPr>
+            <w:tcW w:w="1222" w:type="dxa"/>
+            <w:tcBorders>
+              <w:start w:val="single" w:sz="2" w:space="0" w:color="808080"/>
+              <w:bottom w:val="single" w:sz="2" w:space="0" w:color="808080"/>
+              <w:end w:val="single" w:sz="6" w:space="0" w:color="808080"/>
+            </w:tcBorders>
+            <w:vAlign w:val="center"/>
+          </w:tcPr>
+          <w:p>
+            <w:pPr>
+              <w:pStyle w:val="TableContents"/>
+              <w:spacing w:before="0" w:after="140"/>
+              <w:rPr/>
+            </w:pPr>
+            <w:r>
+              <w:rPr/>
+              <w:t>~$42.50/mo</w:t>
+            </w:r>
+          </w:p>
+        </w:tc>
+        <w:tc>
+          <w:tcPr>
+            <w:tcW w:w="1254" w:type="dxa"/>
+            <w:tcBorders>
+              <w:start w:val="single" w:sz="2" w:space="0" w:color="808080"/>
+              <w:bottom w:val="single" w:sz="2" w:space="0" w:color="808080"/>
+              <w:end w:val="single" w:sz="6" w:space="0" w:color="808080"/>
+            </w:tcBorders>
+            <w:vAlign w:val="center"/>
+          </w:tcPr>
+          <w:p>
+            <w:pPr>
+              <w:pStyle w:val="TableContents"/>
+              <w:spacing w:before="0" w:after="140"/>
+              <w:rPr/>
+            </w:pPr>
+            <w:r>
+              <w:rPr/>
+              <w:t>50%</w:t>
+            </w:r>
+          </w:p>
+        </w:tc>
+        <w:tc>
+          <w:tcPr>
+            <w:tcW w:w="1829" w:type="dxa"/>
+            <w:tcBorders>
+              <w:start w:val="single" w:sz="2" w:space="0" w:color="808080"/>
+              <w:bottom w:val="single" w:sz="2" w:space="0" w:color="808080"/>
+              <w:end w:val="single" w:sz="6" w:space="0" w:color="808080"/>
+            </w:tcBorders>
+            <w:vAlign w:val="center"/>
+          </w:tcPr>
+          <w:p>
+            <w:pPr>
+              <w:pStyle w:val="TableContents"/>
+              <w:spacing w:before="0" w:after="140"/>
+              <w:rPr/>
+            </w:pPr>
+            <w:r>
+              <w:rPr/>
+              <w:t>$85.00</w:t>
+            </w:r>
+          </w:p>
+        </w:tc>
+      </w:tr>
+      <w:tr>
+        <w:trPr/>
+        <w:tc>
+          <w:tcPr>
+            <w:tcW w:w="5900" w:type="dxa"/>
+            <w:tcBorders>
+              <w:start w:val="single" w:sz="6" w:space="0" w:color="808080"/>
+              <w:bottom w:val="single" w:sz="2" w:space="0" w:color="808080"/>
+              <w:end w:val="single" w:sz="6" w:space="0" w:color="808080"/>
+            </w:tcBorders>
+            <w:vAlign w:val="center"/>
+          </w:tcPr>
+          <w:p>
+            <w:pPr>
+              <w:pStyle w:val="TableContents"/>
+              <w:spacing w:before="0" w:after="140"/>
+              <w:rPr/>
+            </w:pPr>
+            <w:r>
+              <w:rPr/>
+              <w:t>Phone (AT&amp;T, primary line only — CONFIRM, larger bill excluded pending clarification)</w:t>
+            </w:r>
+          </w:p>
+        </w:tc>
+        <w:tc>
+          <w:tcPr>
+            <w:tcW w:w="1222" w:type="dxa"/>
+            <w:tcBorders>
+              <w:start w:val="single" w:sz="2" w:space="0" w:color="808080"/>
+              <w:bottom w:val="single" w:sz="2" w:space="0" w:color="808080"/>
+              <w:end w:val="single" w:sz="6" w:space="0" w:color="808080"/>
+            </w:tcBorders>
+            <w:vAlign w:val="center"/>
+          </w:tcPr>
+          <w:p>
+            <w:pPr>
+              <w:pStyle w:val="TableContents"/>
+              <w:spacing w:before="0" w:after="140"/>
+              <w:rPr/>
+            </w:pPr>
+            <w:r>
+              <w:rPr/>
+              <w:t>~$37.50/mo</w:t>
+            </w:r>
+          </w:p>
+        </w:tc>
+        <w:tc>
+          <w:tcPr>
+            <w:tcW w:w="1254" w:type="dxa"/>
+            <w:tcBorders>
+              <w:start w:val="single" w:sz="2" w:space="0" w:color="808080"/>
+              <w:bottom w:val="single" w:sz="2" w:space="0" w:color="808080"/>
+              <w:end w:val="single" w:sz="6" w:space="0" w:color="808080"/>
+            </w:tcBorders>
+            <w:vAlign w:val="center"/>
+          </w:tcPr>
+          <w:p>
+            <w:pPr>
+              <w:pStyle w:val="TableContents"/>
+              <w:spacing w:before="0" w:after="140"/>
+              <w:rPr/>
+            </w:pPr>
+            <w:r>
+              <w:rPr/>
+              <w:t>50%</w:t>
+            </w:r>
+          </w:p>
+        </w:tc>
+        <w:tc>
+          <w:tcPr>
+            <w:tcW w:w="1829" w:type="dxa"/>
+            <w:tcBorders>
+              <w:start w:val="single" w:sz="2" w:space="0" w:color="808080"/>
+              <w:bottom w:val="single" w:sz="2" w:space="0" w:color="808080"/>
+              <w:end w:val="single" w:sz="6" w:space="0" w:color="808080"/>
+            </w:tcBorders>
+            <w:vAlign w:val="center"/>
+          </w:tcPr>
+          <w:p>
+            <w:pPr>
+              <w:pStyle w:val="TableContents"/>
+              <w:spacing w:before="0" w:after="140"/>
+              <w:rPr/>
+            </w:pPr>
+            <w:r>
+              <w:rPr/>
+              <w:t>$75.00</w:t>
+            </w:r>
+          </w:p>
+        </w:tc>
+      </w:tr>
+      <w:tr>
+        <w:trPr/>
+        <w:tc>
+          <w:tcPr>
+            <w:tcW w:w="5900" w:type="dxa"/>
+            <w:tcBorders>
+              <w:start w:val="single" w:sz="6" w:space="0" w:color="808080"/>
+              <w:bottom w:val="single" w:sz="2" w:space="0" w:color="808080"/>
+              <w:end w:val="single" w:sz="6" w:space="0" w:color="808080"/>
+            </w:tcBorders>
+            <w:vAlign w:val="center"/>
+          </w:tcPr>
+          <w:p>
+            <w:pPr>
+              <w:pStyle w:val="TableContents"/>
+              <w:spacing w:before="0" w:after="140"/>
+              <w:rPr/>
+            </w:pPr>
+            <w:r>
+              <w:rPr/>
+              <w:t>Coworking/community (Hacker Dojo)</w:t>
+            </w:r>
+          </w:p>
+        </w:tc>
+        <w:tc>
+          <w:tcPr>
+            <w:tcW w:w="1222" w:type="dxa"/>
+            <w:tcBorders>
+              <w:start w:val="single" w:sz="2" w:space="0" w:color="808080"/>
+              <w:bottom w:val="single" w:sz="2" w:space="0" w:color="808080"/>
+              <w:end w:val="single" w:sz="6" w:space="0" w:color="808080"/>
+            </w:tcBorders>
+            <w:vAlign w:val="center"/>
+          </w:tcPr>
+          <w:p>
+            <w:pPr>
+              <w:pStyle w:val="TableContents"/>
+              <w:spacing w:before="0" w:after="140"/>
+              <w:rPr/>
+            </w:pPr>
+            <w:r>
+              <w:rPr/>
+              <w:t>$75/mo</w:t>
+            </w:r>
+          </w:p>
+        </w:tc>
+        <w:tc>
+          <w:tcPr>
+            <w:tcW w:w="1254" w:type="dxa"/>
+            <w:tcBorders>
+              <w:start w:val="single" w:sz="2" w:space="0" w:color="808080"/>
+              <w:bottom w:val="single" w:sz="2" w:space="0" w:color="808080"/>
+              <w:end w:val="single" w:sz="6" w:space="0" w:color="808080"/>
+            </w:tcBorders>
+            <w:vAlign w:val="center"/>
+          </w:tcPr>
+          <w:p>
+            <w:pPr>
+              <w:pStyle w:val="TableContents"/>
+              <w:spacing w:before="0" w:after="140"/>
+              <w:rPr/>
+            </w:pPr>
+            <w:r>
+              <w:rPr/>
+              <w:t>50%</w:t>
+            </w:r>
+          </w:p>
+        </w:tc>
+        <w:tc>
+          <w:tcPr>
+            <w:tcW w:w="1829" w:type="dxa"/>
+            <w:tcBorders>
+              <w:start w:val="single" w:sz="2" w:space="0" w:color="808080"/>
+              <w:bottom w:val="single" w:sz="2" w:space="0" w:color="808080"/>
+              <w:end w:val="single" w:sz="6" w:space="0" w:color="808080"/>
+            </w:tcBorders>
+            <w:vAlign w:val="center"/>
+          </w:tcPr>
+          <w:p>
+            <w:pPr>
+              <w:pStyle w:val="TableContents"/>
+              <w:spacing w:before="0" w:after="140"/>
+              <w:rPr/>
+            </w:pPr>
+            <w:r>
+              <w:rPr/>
+              <w:t>$150.00</w:t>
+            </w:r>
+          </w:p>
+        </w:tc>
+      </w:tr>
+      <w:tr>
+        <w:trPr/>
+        <w:tc>
+          <w:tcPr>
+            <w:tcW w:w="5900" w:type="dxa"/>
+            <w:tcBorders>
+              <w:start w:val="single" w:sz="6" w:space="0" w:color="808080"/>
+              <w:bottom w:val="single" w:sz="2" w:space="0" w:color="808080"/>
+              <w:end w:val="single" w:sz="6" w:space="0" w:color="808080"/>
+            </w:tcBorders>
+            <w:vAlign w:val="center"/>
+          </w:tcPr>
+          <w:p>
+            <w:pPr>
+              <w:pStyle w:val="TableContents"/>
+              <w:spacing w:before="0" w:after="140"/>
+              <w:rPr/>
+            </w:pPr>
+            <w:r>
+              <w:rPr/>
+              <w:t>Laptop, amortized (ThinkPad X1 Carbon-class, ~$2,000, 24-mo. amortization)</w:t>
+            </w:r>
+          </w:p>
+        </w:tc>
+        <w:tc>
+          <w:tcPr>
+            <w:tcW w:w="1222" w:type="dxa"/>
+            <w:tcBorders>
+              <w:start w:val="single" w:sz="2" w:space="0" w:color="808080"/>
+              <w:bottom w:val="single" w:sz="2" w:space="0" w:color="808080"/>
+              <w:end w:val="single" w:sz="6" w:space="0" w:color="808080"/>
+            </w:tcBorders>
+            <w:vAlign w:val="center"/>
+          </w:tcPr>
+          <w:p>
+            <w:pPr>
+              <w:pStyle w:val="TableContents"/>
+              <w:spacing w:before="0" w:after="140"/>
+              <w:rPr/>
+            </w:pPr>
+            <w:r>
+              <w:rPr/>
+              <w:t>$83.33/mo</w:t>
+            </w:r>
+          </w:p>
+        </w:tc>
+        <w:tc>
+          <w:tcPr>
+            <w:tcW w:w="1254" w:type="dxa"/>
+            <w:tcBorders>
+              <w:start w:val="single" w:sz="2" w:space="0" w:color="808080"/>
+              <w:bottom w:val="single" w:sz="2" w:space="0" w:color="808080"/>
+              <w:end w:val="single" w:sz="6" w:space="0" w:color="808080"/>
+            </w:tcBorders>
+            <w:vAlign w:val="center"/>
+          </w:tcPr>
+          <w:p>
+            <w:pPr>
+              <w:pStyle w:val="TableContents"/>
+              <w:spacing w:before="0" w:after="140"/>
+              <w:rPr/>
+            </w:pPr>
+            <w:r>
+              <w:rPr/>
+              <w:t>80%</w:t>
+            </w:r>
+          </w:p>
+        </w:tc>
+        <w:tc>
+          <w:tcPr>
+            <w:tcW w:w="1829" w:type="dxa"/>
+            <w:tcBorders>
+              <w:start w:val="single" w:sz="2" w:space="0" w:color="808080"/>
+              <w:bottom w:val="single" w:sz="2" w:space="0" w:color="808080"/>
+              <w:end w:val="single" w:sz="6" w:space="0" w:color="808080"/>
+            </w:tcBorders>
+            <w:vAlign w:val="center"/>
+          </w:tcPr>
+          <w:p>
+            <w:pPr>
+              <w:pStyle w:val="TableContents"/>
+              <w:spacing w:before="0" w:after="140"/>
+              <w:rPr/>
+            </w:pPr>
+            <w:r>
+              <w:rPr/>
+              <w:t>$266.67</w:t>
+            </w:r>
+          </w:p>
+        </w:tc>
+      </w:tr>
+      <w:tr>
+        <w:trPr/>
+        <w:tc>
+          <w:tcPr>
+            <w:tcW w:w="5900" w:type="dxa"/>
+            <w:tcBorders>
+              <w:start w:val="single" w:sz="6" w:space="0" w:color="808080"/>
+              <w:bottom w:val="single" w:sz="2" w:space="0" w:color="808080"/>
+              <w:end w:val="single" w:sz="6" w:space="0" w:color="808080"/>
+            </w:tcBorders>
+            <w:vAlign w:val="center"/>
+          </w:tcPr>
+          <w:p>
+            <w:pPr>
+              <w:pStyle w:val="TableContents"/>
+              <w:spacing w:before="0" w:after="140"/>
+              <w:rPr/>
+            </w:pPr>
+            <w:r>
+              <w:rPr/>
+              <w:t>Dev tools (JetBrains/Visual Paradigm, annual)</w:t>
+            </w:r>
+          </w:p>
+        </w:tc>
+        <w:tc>
+          <w:tcPr>
+            <w:tcW w:w="1222" w:type="dxa"/>
+            <w:tcBorders>
+              <w:start w:val="single" w:sz="2" w:space="0" w:color="808080"/>
+              <w:bottom w:val="single" w:sz="2" w:space="0" w:color="808080"/>
+              <w:end w:val="single" w:sz="6" w:space="0" w:color="808080"/>
+            </w:tcBorders>
+            <w:vAlign w:val="center"/>
+          </w:tcPr>
+          <w:p>
+            <w:pPr>
+              <w:pStyle w:val="TableContents"/>
+              <w:spacing w:before="0" w:after="140"/>
+              <w:rPr/>
+            </w:pPr>
+            <w:r>
+              <w:rPr/>
+              <w:t>$139/yr</w:t>
+            </w:r>
+          </w:p>
+        </w:tc>
+        <w:tc>
+          <w:tcPr>
+            <w:tcW w:w="1254" w:type="dxa"/>
+            <w:tcBorders>
+              <w:start w:val="single" w:sz="2" w:space="0" w:color="808080"/>
+              <w:bottom w:val="single" w:sz="2" w:space="0" w:color="808080"/>
+              <w:end w:val="single" w:sz="6" w:space="0" w:color="808080"/>
+            </w:tcBorders>
+            <w:vAlign w:val="center"/>
+          </w:tcPr>
+          <w:p>
+            <w:pPr>
+              <w:pStyle w:val="TableContents"/>
+              <w:spacing w:before="0" w:after="140"/>
+              <w:rPr/>
+            </w:pPr>
+            <w:r>
+              <w:rPr/>
+              <w:t>50%</w:t>
+            </w:r>
+          </w:p>
+        </w:tc>
+        <w:tc>
+          <w:tcPr>
+            <w:tcW w:w="1829" w:type="dxa"/>
+            <w:tcBorders>
+              <w:start w:val="single" w:sz="2" w:space="0" w:color="808080"/>
+              <w:bottom w:val="single" w:sz="2" w:space="0" w:color="808080"/>
+              <w:end w:val="single" w:sz="6" w:space="0" w:color="808080"/>
+            </w:tcBorders>
+            <w:vAlign w:val="center"/>
+          </w:tcPr>
+          <w:p>
+            <w:pPr>
+              <w:pStyle w:val="TableContents"/>
+              <w:spacing w:before="0" w:after="140"/>
+              <w:rPr/>
+            </w:pPr>
+            <w:r>
+              <w:rPr/>
+              <w:t>$23.17</w:t>
+            </w:r>
+          </w:p>
+        </w:tc>
+      </w:tr>
+      <w:tr>
+        <w:trPr/>
+        <w:tc>
+          <w:tcPr>
+            <w:tcW w:w="5900" w:type="dxa"/>
+            <w:tcBorders>
+              <w:start w:val="single" w:sz="6" w:space="0" w:color="808080"/>
+              <w:bottom w:val="single" w:sz="2" w:space="0" w:color="808080"/>
+              <w:end w:val="single" w:sz="6" w:space="0" w:color="808080"/>
+            </w:tcBorders>
+            <w:vAlign w:val="center"/>
+          </w:tcPr>
+          <w:p>
+            <w:pPr>
+              <w:pStyle w:val="TableContents"/>
+              <w:spacing w:before="0" w:after="140"/>
+              <w:rPr/>
+            </w:pPr>
+            <w:r>
+              <w:rPr/>
+              <w:t xml:space="preserve">Printing  </w:t>
+            </w:r>
+          </w:p>
+        </w:tc>
+        <w:tc>
+          <w:tcPr>
+            <w:tcW w:w="1222" w:type="dxa"/>
+            <w:tcBorders>
+              <w:start w:val="single" w:sz="2" w:space="0" w:color="808080"/>
+              <w:bottom w:val="single" w:sz="2" w:space="0" w:color="808080"/>
+              <w:end w:val="single" w:sz="6" w:space="0" w:color="808080"/>
+            </w:tcBorders>
+            <w:vAlign w:val="center"/>
+          </w:tcPr>
+          <w:p>
+            <w:pPr>
+              <w:pStyle w:val="TableContents"/>
+              <w:spacing w:before="0" w:after="140"/>
+              <w:rPr/>
+            </w:pPr>
+            <w:r>
+              <w:rPr/>
+              <w:t>~$75/yr</w:t>
+            </w:r>
+          </w:p>
+        </w:tc>
+        <w:tc>
+          <w:tcPr>
+            <w:tcW w:w="1254" w:type="dxa"/>
+            <w:tcBorders>
+              <w:start w:val="single" w:sz="2" w:space="0" w:color="808080"/>
+              <w:bottom w:val="single" w:sz="2" w:space="0" w:color="808080"/>
+              <w:end w:val="single" w:sz="6" w:space="0" w:color="808080"/>
+            </w:tcBorders>
+            <w:vAlign w:val="center"/>
+          </w:tcPr>
+          <w:p>
+            <w:pPr>
+              <w:pStyle w:val="TableContents"/>
+              <w:spacing w:before="0" w:after="140"/>
+              <w:rPr/>
+            </w:pPr>
+            <w:r>
+              <w:rPr/>
+              <w:t>50%</w:t>
+            </w:r>
+          </w:p>
+        </w:tc>
+        <w:tc>
+          <w:tcPr>
+            <w:tcW w:w="1829" w:type="dxa"/>
+            <w:tcBorders>
+              <w:start w:val="single" w:sz="2" w:space="0" w:color="808080"/>
+              <w:bottom w:val="single" w:sz="2" w:space="0" w:color="808080"/>
+              <w:end w:val="single" w:sz="6" w:space="0" w:color="808080"/>
+            </w:tcBorders>
+            <w:vAlign w:val="center"/>
+          </w:tcPr>
+          <w:p>
+            <w:pPr>
+              <w:pStyle w:val="TableContents"/>
+              <w:spacing w:before="0" w:after="140"/>
+              <w:rPr/>
+            </w:pPr>
+            <w:r>
+              <w:rPr/>
+              <w:t>$12.50</w:t>
+            </w:r>
+          </w:p>
+        </w:tc>
+      </w:tr>
+      <w:tr>
+        <w:trPr/>
+        <w:tc>
+          <w:tcPr>
+            <w:tcW w:w="5900" w:type="dxa"/>
+            <w:tcBorders>
+              <w:start w:val="single" w:sz="6" w:space="0" w:color="808080"/>
+              <w:bottom w:val="single" w:sz="2" w:space="0" w:color="808080"/>
+              <w:end w:val="single" w:sz="6" w:space="0" w:color="808080"/>
+            </w:tcBorders>
+            <w:vAlign w:val="center"/>
+          </w:tcPr>
+          <w:p>
+            <w:pPr>
+              <w:pStyle w:val="TableContents"/>
+              <w:spacing w:before="0" w:after="140"/>
+              <w:rPr/>
+            </w:pPr>
+            <w:r>
+              <w:rPr/>
+              <w:t xml:space="preserve">Shipping  </w:t>
+            </w:r>
+          </w:p>
+        </w:tc>
+        <w:tc>
+          <w:tcPr>
+            <w:tcW w:w="1222" w:type="dxa"/>
+            <w:tcBorders>
+              <w:start w:val="single" w:sz="2" w:space="0" w:color="808080"/>
+              <w:bottom w:val="single" w:sz="2" w:space="0" w:color="808080"/>
+              <w:end w:val="single" w:sz="6" w:space="0" w:color="808080"/>
+            </w:tcBorders>
+            <w:vAlign w:val="center"/>
+          </w:tcPr>
+          <w:p>
+            <w:pPr>
+              <w:pStyle w:val="TableContents"/>
+              <w:spacing w:before="0" w:after="140"/>
+              <w:rPr/>
+            </w:pPr>
+            <w:r>
+              <w:rPr/>
+              <w:t>~$60/yr</w:t>
+            </w:r>
+          </w:p>
+        </w:tc>
+        <w:tc>
+          <w:tcPr>
+            <w:tcW w:w="1254" w:type="dxa"/>
+            <w:tcBorders>
+              <w:start w:val="single" w:sz="2" w:space="0" w:color="808080"/>
+              <w:bottom w:val="single" w:sz="2" w:space="0" w:color="808080"/>
+              <w:end w:val="single" w:sz="6" w:space="0" w:color="808080"/>
+            </w:tcBorders>
+            <w:vAlign w:val="center"/>
+          </w:tcPr>
+          <w:p>
+            <w:pPr>
+              <w:pStyle w:val="TableContents"/>
+              <w:spacing w:before="0" w:after="140"/>
+              <w:rPr/>
+            </w:pPr>
+            <w:r>
+              <w:rPr/>
+              <w:t>50%</w:t>
+            </w:r>
+          </w:p>
+        </w:tc>
+        <w:tc>
+          <w:tcPr>
+            <w:tcW w:w="1829" w:type="dxa"/>
+            <w:tcBorders>
+              <w:start w:val="single" w:sz="2" w:space="0" w:color="808080"/>
+              <w:bottom w:val="single" w:sz="2" w:space="0" w:color="808080"/>
+              <w:end w:val="single" w:sz="6" w:space="0" w:color="808080"/>
+            </w:tcBorders>
+            <w:vAlign w:val="center"/>
+          </w:tcPr>
+          <w:p>
+            <w:pPr>
+              <w:pStyle w:val="TableContents"/>
+              <w:spacing w:before="0" w:after="140"/>
+              <w:rPr/>
+            </w:pPr>
+            <w:r>
+              <w:rPr/>
+              <w:t>$10.00</w:t>
+            </w:r>
+          </w:p>
+        </w:tc>
+      </w:tr>
+      <w:tr>
+        <w:trPr/>
+        <w:tc>
+          <w:tcPr>
+            <w:tcW w:w="5900" w:type="dxa"/>
+            <w:tcBorders>
+              <w:start w:val="single" w:sz="6" w:space="0" w:color="808080"/>
+              <w:bottom w:val="single" w:sz="2" w:space="0" w:color="808080"/>
+              <w:end w:val="single" w:sz="6" w:space="0" w:color="808080"/>
+            </w:tcBorders>
+            <w:vAlign w:val="center"/>
+          </w:tcPr>
+          <w:p>
+            <w:pPr>
+              <w:pStyle w:val="TableContents"/>
+              <w:spacing w:before="0" w:after="140"/>
+              <w:rPr/>
+            </w:pPr>
+            <w:r>
+              <w:rPr/>
+              <w:t xml:space="preserve">Conferences/travel  </w:t>
+            </w:r>
+          </w:p>
+        </w:tc>
+        <w:tc>
+          <w:tcPr>
+            <w:tcW w:w="1222" w:type="dxa"/>
+            <w:tcBorders>
+              <w:start w:val="single" w:sz="2" w:space="0" w:color="808080"/>
+              <w:bottom w:val="single" w:sz="2" w:space="0" w:color="808080"/>
+              <w:end w:val="single" w:sz="6" w:space="0" w:color="808080"/>
+            </w:tcBorders>
+            <w:vAlign w:val="center"/>
+          </w:tcPr>
+          <w:p>
+            <w:pPr>
+              <w:pStyle w:val="TableContents"/>
+              <w:spacing w:before="0" w:after="140"/>
+              <w:rPr/>
+            </w:pPr>
+            <w:r>
+              <w:rPr/>
+              <w:t>~$750/yr</w:t>
+            </w:r>
+          </w:p>
+        </w:tc>
+        <w:tc>
+          <w:tcPr>
+            <w:tcW w:w="1254" w:type="dxa"/>
+            <w:tcBorders>
+              <w:start w:val="single" w:sz="2" w:space="0" w:color="808080"/>
+              <w:bottom w:val="single" w:sz="2" w:space="0" w:color="808080"/>
+              <w:end w:val="single" w:sz="6" w:space="0" w:color="808080"/>
+            </w:tcBorders>
+            <w:vAlign w:val="center"/>
+          </w:tcPr>
+          <w:p>
+            <w:pPr>
+              <w:pStyle w:val="TableContents"/>
+              <w:spacing w:before="0" w:after="140"/>
+              <w:rPr/>
+            </w:pPr>
+            <w:r>
+              <w:rPr/>
+              <w:t>50%</w:t>
+            </w:r>
+          </w:p>
+        </w:tc>
+        <w:tc>
+          <w:tcPr>
+            <w:tcW w:w="1829" w:type="dxa"/>
+            <w:tcBorders>
+              <w:start w:val="single" w:sz="2" w:space="0" w:color="808080"/>
+              <w:bottom w:val="single" w:sz="2" w:space="0" w:color="808080"/>
+              <w:end w:val="single" w:sz="6" w:space="0" w:color="808080"/>
+            </w:tcBorders>
+            <w:vAlign w:val="center"/>
+          </w:tcPr>
+          <w:p>
+            <w:pPr>
+              <w:pStyle w:val="TableContents"/>
+              <w:spacing w:before="0" w:after="140"/>
+              <w:rPr/>
+            </w:pPr>
+            <w:r>
+              <w:rPr/>
+              <w:t>$125.00</w:t>
+            </w:r>
+          </w:p>
+        </w:tc>
+      </w:tr>
+      <w:tr>
+        <w:trPr/>
+        <w:tc>
+          <w:tcPr>
+            <w:tcW w:w="5900" w:type="dxa"/>
+            <w:tcBorders>
+              <w:start w:val="single" w:sz="6" w:space="0" w:color="808080"/>
+              <w:bottom w:val="single" w:sz="6" w:space="0" w:color="808080"/>
+              <w:end w:val="single" w:sz="6" w:space="0" w:color="808080"/>
+            </w:tcBorders>
+            <w:vAlign w:val="center"/>
+          </w:tcPr>
+          <w:p>
+            <w:pPr>
+              <w:pStyle w:val="TableContents"/>
+              <w:spacing w:before="0" w:after="140"/>
+              <w:rPr>
+                <w:b/>
+              </w:rPr>
+            </w:pPr>
+            <w:r>
+              <w:rPr>
+                <w:b/>
+              </w:rPr>
+              <w:t>Operational Expenses Total</w:t>
+            </w:r>
+          </w:p>
+        </w:tc>
+        <w:tc>
+          <w:tcPr>
+            <w:tcW w:w="1222" w:type="dxa"/>
+            <w:tcBorders>
+              <w:start w:val="single" w:sz="2" w:space="0" w:color="808080"/>
+              <w:bottom w:val="single" w:sz="6" w:space="0" w:color="808080"/>
+              <w:end w:val="single" w:sz="6" w:space="0" w:color="808080"/>
+            </w:tcBorders>
+            <w:vAlign w:val="center"/>
+          </w:tcPr>
+          <w:p>
+            <w:pPr>
+              <w:pStyle w:val="TableContents"/>
+              <w:spacing w:before="0" w:after="140"/>
+              <w:rPr>
+                <w:sz w:val="4"/>
+                <w:szCs w:val="4"/>
+              </w:rPr>
+            </w:pPr>
+            <w:r>
+              <w:rPr>
+                <w:sz w:val="4"/>
+                <w:szCs w:val="4"/>
+              </w:rPr>
+            </w:r>
+          </w:p>
+        </w:tc>
+        <w:tc>
+          <w:tcPr>
+            <w:tcW w:w="1254" w:type="dxa"/>
+            <w:tcBorders>
+              <w:start w:val="single" w:sz="2" w:space="0" w:color="808080"/>
+              <w:bottom w:val="single" w:sz="6" w:space="0" w:color="808080"/>
+              <w:end w:val="single" w:sz="6" w:space="0" w:color="808080"/>
+            </w:tcBorders>
+            <w:vAlign w:val="center"/>
+          </w:tcPr>
+          <w:p>
+            <w:pPr>
+              <w:pStyle w:val="TableContents"/>
+              <w:spacing w:before="0" w:after="140"/>
+              <w:rPr>
+                <w:sz w:val="4"/>
+                <w:szCs w:val="4"/>
+              </w:rPr>
+            </w:pPr>
+            <w:r>
+              <w:rPr>
+                <w:sz w:val="4"/>
+                <w:szCs w:val="4"/>
+              </w:rPr>
+            </w:r>
+          </w:p>
+        </w:tc>
+        <w:tc>
+          <w:tcPr>
+            <w:tcW w:w="1829" w:type="dxa"/>
+            <w:tcBorders>
+              <w:start w:val="single" w:sz="2" w:space="0" w:color="808080"/>
+              <w:bottom w:val="single" w:sz="6" w:space="0" w:color="808080"/>
+              <w:end w:val="single" w:sz="6" w:space="0" w:color="808080"/>
+            </w:tcBorders>
+            <w:vAlign w:val="center"/>
+          </w:tcPr>
+          <w:p>
+            <w:pPr>
+              <w:pStyle w:val="TableContents"/>
+              <w:spacing w:before="0" w:after="140"/>
+              <w:rPr>
+                <w:b/>
+              </w:rPr>
+            </w:pPr>
+            <w:r>
+              <w:rPr>
+                <w:b/>
+              </w:rPr>
+              <w:t>$827.33</w:t>
+            </w:r>
+          </w:p>
+        </w:tc>
+      </w:tr>
+    </w:tbl>
+    <w:p>
+      <w:pPr>
+        <w:pStyle w:val="Heading2"/>
+        <w:rPr>
+          <w:sz w:val="20"/>
+          <w:szCs w:val="20"/>
+        </w:rPr>
+      </w:pPr>
+      <w:r>
+        <w:rPr>
+          <w:sz w:val="20"/>
+          <w:szCs w:val="20"/>
+        </w:rPr>
+      </w:r>
+      <w:r>
+        <w:br w:type="page"/>
+      </w:r>
+    </w:p>
+    <w:p>
+      <w:pPr>
+        <w:pStyle w:val="Heading2"/>
+        <w:spacing w:before="0" w:after="80"/>
         <w:rPr>
           <w:b/>
           <w:bCs/>
@@ -1420,7 +2586,7 @@
       <w:tblPr>
         <w:tblW w:w="10205" w:type="dxa"/>
         <w:jc w:val="start"/>
-        <w:tblInd w:w="-7" w:type="dxa"/>
+        <w:tblInd w:w="-6" w:type="dxa"/>
         <w:tblLayout w:type="fixed"/>
         <w:tblCellMar>
           <w:top w:w="90" w:type="dxa"/>
@@ -1431,8 +2597,8 @@
       </w:tblPr>
       <w:tblGrid>
         <w:gridCol w:w="6840"/>
-        <w:gridCol w:w="1620"/>
-        <w:gridCol w:w="1745"/>
+        <w:gridCol w:w="1618"/>
+        <w:gridCol w:w="1747"/>
       </w:tblGrid>
       <w:tr>
         <w:trPr/>
@@ -1467,7 +2633,7 @@
         </w:tc>
         <w:tc>
           <w:tcPr>
-            <w:tcW w:w="1620" w:type="dxa"/>
+            <w:tcW w:w="1618" w:type="dxa"/>
             <w:tcBorders>
               <w:top w:val="single" w:sz="6" w:space="0" w:color="808080"/>
               <w:start w:val="single" w:sz="2" w:space="0" w:color="808080"/>
@@ -1496,7 +2662,7 @@
         </w:tc>
         <w:tc>
           <w:tcPr>
-            <w:tcW w:w="1745" w:type="dxa"/>
+            <w:tcW w:w="1747" w:type="dxa"/>
             <w:tcBorders>
               <w:top w:val="single" w:sz="6" w:space="0" w:color="808080"/>
               <w:start w:val="single" w:sz="2" w:space="0" w:color="808080"/>
@@ -1556,7 +2722,7 @@
         </w:tc>
         <w:tc>
           <w:tcPr>
-            <w:tcW w:w="1620" w:type="dxa"/>
+            <w:tcW w:w="1618" w:type="dxa"/>
             <w:tcBorders>
               <w:start w:val="single" w:sz="2" w:space="0" w:color="808080"/>
               <w:bottom w:val="single" w:sz="2" w:space="0" w:color="808080"/>
@@ -1584,7 +2750,7 @@
         </w:tc>
         <w:tc>
           <w:tcPr>
-            <w:tcW w:w="1745" w:type="dxa"/>
+            <w:tcW w:w="1747" w:type="dxa"/>
             <w:tcBorders>
               <w:start w:val="single" w:sz="2" w:space="0" w:color="808080"/>
               <w:bottom w:val="single" w:sz="2" w:space="0" w:color="808080"/>
@@ -1645,7 +2811,7 @@
         </w:tc>
         <w:tc>
           <w:tcPr>
-            <w:tcW w:w="1620" w:type="dxa"/>
+            <w:tcW w:w="1618" w:type="dxa"/>
             <w:tcBorders>
               <w:start w:val="single" w:sz="2" w:space="0" w:color="808080"/>
               <w:bottom w:val="single" w:sz="6" w:space="0" w:color="808080"/>
@@ -1675,7 +2841,7 @@
         </w:tc>
         <w:tc>
           <w:tcPr>
-            <w:tcW w:w="1745" w:type="dxa"/>
+            <w:tcW w:w="1747" w:type="dxa"/>
             <w:tcBorders>
               <w:start w:val="single" w:sz="2" w:space="0" w:color="808080"/>
               <w:bottom w:val="single" w:sz="6" w:space="0" w:color="808080"/>
@@ -1767,7 +2933,7 @@
       <w:tblPr>
         <w:tblW w:w="10170" w:type="dxa"/>
         <w:jc w:val="start"/>
-        <w:tblInd w:w="-7" w:type="dxa"/>
+        <w:tblInd w:w="-6" w:type="dxa"/>
         <w:tblLayout w:type="fixed"/>
         <w:tblCellMar>
           <w:top w:w="90" w:type="dxa"/>
@@ -1777,15 +2943,15 @@
         </w:tblCellMar>
       </w:tblPr>
       <w:tblGrid>
-        <w:gridCol w:w="6809"/>
-        <w:gridCol w:w="1651"/>
+        <w:gridCol w:w="6807"/>
+        <w:gridCol w:w="1653"/>
         <w:gridCol w:w="1710"/>
       </w:tblGrid>
       <w:tr>
         <w:trPr/>
         <w:tc>
           <w:tcPr>
-            <w:tcW w:w="6809" w:type="dxa"/>
+            <w:tcW w:w="6807" w:type="dxa"/>
             <w:tcBorders>
               <w:top w:val="single" w:sz="6" w:space="0" w:color="808080"/>
               <w:start w:val="single" w:sz="6" w:space="0" w:color="808080"/>
@@ -1814,7 +2980,7 @@
         </w:tc>
         <w:tc>
           <w:tcPr>
-            <w:tcW w:w="1651" w:type="dxa"/>
+            <w:tcW w:w="1653" w:type="dxa"/>
             <w:tcBorders>
               <w:top w:val="single" w:sz="6" w:space="0" w:color="808080"/>
               <w:start w:val="single" w:sz="2" w:space="0" w:color="808080"/>
@@ -1875,7 +3041,7 @@
         <w:trPr/>
         <w:tc>
           <w:tcPr>
-            <w:tcW w:w="6809" w:type="dxa"/>
+            <w:tcW w:w="6807" w:type="dxa"/>
             <w:tcBorders>
               <w:start w:val="single" w:sz="6" w:space="0" w:color="808080"/>
               <w:bottom w:val="single" w:sz="2" w:space="0" w:color="808080"/>
@@ -1903,7 +3069,7 @@
         </w:tc>
         <w:tc>
           <w:tcPr>
-            <w:tcW w:w="1651" w:type="dxa"/>
+            <w:tcW w:w="1653" w:type="dxa"/>
             <w:tcBorders>
               <w:start w:val="single" w:sz="2" w:space="0" w:color="808080"/>
               <w:bottom w:val="single" w:sz="2" w:space="0" w:color="808080"/>
@@ -1962,7 +3128,7 @@
         <w:trPr/>
         <w:tc>
           <w:tcPr>
-            <w:tcW w:w="6809" w:type="dxa"/>
+            <w:tcW w:w="6807" w:type="dxa"/>
             <w:tcBorders>
               <w:start w:val="single" w:sz="6" w:space="0" w:color="808080"/>
               <w:bottom w:val="single" w:sz="2" w:space="0" w:color="808080"/>
@@ -1990,7 +3156,7 @@
         </w:tc>
         <w:tc>
           <w:tcPr>
-            <w:tcW w:w="1651" w:type="dxa"/>
+            <w:tcW w:w="1653" w:type="dxa"/>
             <w:tcBorders>
               <w:start w:val="single" w:sz="2" w:space="0" w:color="808080"/>
               <w:bottom w:val="single" w:sz="2" w:space="0" w:color="808080"/>
@@ -2049,7 +3215,7 @@
         <w:trPr/>
         <w:tc>
           <w:tcPr>
-            <w:tcW w:w="6809" w:type="dxa"/>
+            <w:tcW w:w="6807" w:type="dxa"/>
             <w:tcBorders>
               <w:start w:val="single" w:sz="6" w:space="0" w:color="808080"/>
               <w:bottom w:val="single" w:sz="2" w:space="0" w:color="808080"/>
@@ -2077,7 +3243,7 @@
         </w:tc>
         <w:tc>
           <w:tcPr>
-            <w:tcW w:w="1651" w:type="dxa"/>
+            <w:tcW w:w="1653" w:type="dxa"/>
             <w:tcBorders>
               <w:start w:val="single" w:sz="2" w:space="0" w:color="808080"/>
               <w:bottom w:val="single" w:sz="2" w:space="0" w:color="808080"/>
@@ -2136,7 +3302,7 @@
         <w:trPr/>
         <w:tc>
           <w:tcPr>
-            <w:tcW w:w="6809" w:type="dxa"/>
+            <w:tcW w:w="6807" w:type="dxa"/>
             <w:tcBorders>
               <w:start w:val="single" w:sz="6" w:space="0" w:color="808080"/>
               <w:bottom w:val="single" w:sz="2" w:space="0" w:color="808080"/>
@@ -2164,7 +3330,7 @@
         </w:tc>
         <w:tc>
           <w:tcPr>
-            <w:tcW w:w="1651" w:type="dxa"/>
+            <w:tcW w:w="1653" w:type="dxa"/>
             <w:tcBorders>
               <w:start w:val="single" w:sz="2" w:space="0" w:color="808080"/>
               <w:bottom w:val="single" w:sz="2" w:space="0" w:color="808080"/>
@@ -2223,7 +3389,7 @@
         <w:trPr/>
         <w:tc>
           <w:tcPr>
-            <w:tcW w:w="6809" w:type="dxa"/>
+            <w:tcW w:w="6807" w:type="dxa"/>
             <w:tcBorders>
               <w:start w:val="single" w:sz="6" w:space="0" w:color="808080"/>
               <w:bottom w:val="single" w:sz="2" w:space="0" w:color="808080"/>
@@ -2251,7 +3417,7 @@
         </w:tc>
         <w:tc>
           <w:tcPr>
-            <w:tcW w:w="1651" w:type="dxa"/>
+            <w:tcW w:w="1653" w:type="dxa"/>
             <w:tcBorders>
               <w:start w:val="single" w:sz="2" w:space="0" w:color="808080"/>
               <w:bottom w:val="single" w:sz="2" w:space="0" w:color="808080"/>
@@ -2310,7 +3476,7 @@
         <w:trPr/>
         <w:tc>
           <w:tcPr>
-            <w:tcW w:w="6809" w:type="dxa"/>
+            <w:tcW w:w="6807" w:type="dxa"/>
             <w:tcBorders>
               <w:start w:val="single" w:sz="6" w:space="0" w:color="808080"/>
               <w:bottom w:val="single" w:sz="2" w:space="0" w:color="808080"/>
@@ -2338,7 +3504,7 @@
         </w:tc>
         <w:tc>
           <w:tcPr>
-            <w:tcW w:w="1651" w:type="dxa"/>
+            <w:tcW w:w="1653" w:type="dxa"/>
             <w:tcBorders>
               <w:start w:val="single" w:sz="2" w:space="0" w:color="808080"/>
               <w:bottom w:val="single" w:sz="2" w:space="0" w:color="808080"/>
@@ -2397,7 +3563,7 @@
         <w:trPr/>
         <w:tc>
           <w:tcPr>
-            <w:tcW w:w="6809" w:type="dxa"/>
+            <w:tcW w:w="6807" w:type="dxa"/>
             <w:tcBorders>
               <w:start w:val="single" w:sz="6" w:space="0" w:color="808080"/>
               <w:bottom w:val="single" w:sz="2" w:space="0" w:color="808080"/>
@@ -2425,7 +3591,7 @@
         </w:tc>
         <w:tc>
           <w:tcPr>
-            <w:tcW w:w="1651" w:type="dxa"/>
+            <w:tcW w:w="1653" w:type="dxa"/>
             <w:tcBorders>
               <w:start w:val="single" w:sz="2" w:space="0" w:color="808080"/>
               <w:bottom w:val="single" w:sz="2" w:space="0" w:color="808080"/>
@@ -2484,7 +3650,7 @@
         <w:trPr/>
         <w:tc>
           <w:tcPr>
-            <w:tcW w:w="6809" w:type="dxa"/>
+            <w:tcW w:w="6807" w:type="dxa"/>
             <w:tcBorders>
               <w:start w:val="single" w:sz="6" w:space="0" w:color="808080"/>
               <w:bottom w:val="single" w:sz="2" w:space="0" w:color="808080"/>
@@ -2512,7 +3678,7 @@
         </w:tc>
         <w:tc>
           <w:tcPr>
-            <w:tcW w:w="1651" w:type="dxa"/>
+            <w:tcW w:w="1653" w:type="dxa"/>
             <w:tcBorders>
               <w:start w:val="single" w:sz="2" w:space="0" w:color="808080"/>
               <w:bottom w:val="single" w:sz="2" w:space="0" w:color="808080"/>
@@ -2571,7 +3737,7 @@
         <w:trPr/>
         <w:tc>
           <w:tcPr>
-            <w:tcW w:w="6809" w:type="dxa"/>
+            <w:tcW w:w="6807" w:type="dxa"/>
             <w:tcBorders>
               <w:start w:val="single" w:sz="6" w:space="0" w:color="808080"/>
               <w:bottom w:val="single" w:sz="2" w:space="0" w:color="808080"/>
@@ -2599,7 +3765,7 @@
         </w:tc>
         <w:tc>
           <w:tcPr>
-            <w:tcW w:w="1651" w:type="dxa"/>
+            <w:tcW w:w="1653" w:type="dxa"/>
             <w:tcBorders>
               <w:start w:val="single" w:sz="2" w:space="0" w:color="808080"/>
               <w:bottom w:val="single" w:sz="2" w:space="0" w:color="808080"/>
@@ -2658,7 +3824,7 @@
         <w:trPr/>
         <w:tc>
           <w:tcPr>
-            <w:tcW w:w="6809" w:type="dxa"/>
+            <w:tcW w:w="6807" w:type="dxa"/>
             <w:tcBorders>
               <w:start w:val="single" w:sz="6" w:space="0" w:color="808080"/>
               <w:bottom w:val="single" w:sz="2" w:space="0" w:color="808080"/>
@@ -2686,7 +3852,7 @@
         </w:tc>
         <w:tc>
           <w:tcPr>
-            <w:tcW w:w="1651" w:type="dxa"/>
+            <w:tcW w:w="1653" w:type="dxa"/>
             <w:tcBorders>
               <w:start w:val="single" w:sz="2" w:space="0" w:color="808080"/>
               <w:bottom w:val="single" w:sz="2" w:space="0" w:color="808080"/>
@@ -2745,7 +3911,7 @@
         <w:trPr/>
         <w:tc>
           <w:tcPr>
-            <w:tcW w:w="6809" w:type="dxa"/>
+            <w:tcW w:w="6807" w:type="dxa"/>
             <w:tcBorders>
               <w:start w:val="single" w:sz="6" w:space="0" w:color="808080"/>
               <w:bottom w:val="single" w:sz="2" w:space="0" w:color="808080"/>
@@ -2773,7 +3939,7 @@
         </w:tc>
         <w:tc>
           <w:tcPr>
-            <w:tcW w:w="1651" w:type="dxa"/>
+            <w:tcW w:w="1653" w:type="dxa"/>
             <w:tcBorders>
               <w:start w:val="single" w:sz="2" w:space="0" w:color="808080"/>
               <w:bottom w:val="single" w:sz="2" w:space="0" w:color="808080"/>
@@ -2832,7 +3998,7 @@
         <w:trPr/>
         <w:tc>
           <w:tcPr>
-            <w:tcW w:w="6809" w:type="dxa"/>
+            <w:tcW w:w="6807" w:type="dxa"/>
             <w:tcBorders>
               <w:start w:val="single" w:sz="6" w:space="0" w:color="808080"/>
               <w:bottom w:val="single" w:sz="6" w:space="0" w:color="808080"/>
@@ -2862,7 +4028,7 @@
         </w:tc>
         <w:tc>
           <w:tcPr>
-            <w:tcW w:w="1651" w:type="dxa"/>
+            <w:tcW w:w="1653" w:type="dxa"/>
             <w:tcBorders>
               <w:start w:val="single" w:sz="2" w:space="0" w:color="808080"/>
               <w:bottom w:val="single" w:sz="6" w:space="0" w:color="808080"/>
@@ -2943,6 +4109,7 @@
     <w:p>
       <w:pPr>
         <w:pStyle w:val="Heading3"/>
+        <w:spacing w:before="0" w:after="80"/>
         <w:rPr>
           <w:b/>
           <w:bCs/>
@@ -2965,7 +4132,7 @@
       <w:tblPr>
         <w:tblW w:w="9180" w:type="dxa"/>
         <w:jc w:val="start"/>
-        <w:tblInd w:w="-7" w:type="dxa"/>
+        <w:tblInd w:w="-6" w:type="dxa"/>
         <w:tblLayout w:type="fixed"/>
         <w:tblCellMar>
           <w:top w:w="90" w:type="dxa"/>
@@ -3978,7 +5145,7 @@
           <w:sz w:val="24"/>
           <w:szCs w:val="24"/>
         </w:rPr>
-        <w:t>Microsoft 365 Spike</w:t>
+        <w:t>nominatim Spike</w:t>
         <w:br/>
       </w:r>
     </w:p>
@@ -3986,7 +5153,7 @@
       <w:tblPr>
         <w:tblW w:w="9180" w:type="dxa"/>
         <w:jc w:val="start"/>
-        <w:tblInd w:w="-7" w:type="dxa"/>
+        <w:tblInd w:w="-6" w:type="dxa"/>
         <w:tblLayout w:type="fixed"/>
         <w:tblCellMar>
           <w:top w:w="90" w:type="dxa"/>
@@ -3996,15 +5163,15 @@
         </w:tblCellMar>
       </w:tblPr>
       <w:tblGrid>
-        <w:gridCol w:w="5490"/>
-        <w:gridCol w:w="1080"/>
+        <w:gridCol w:w="5488"/>
+        <w:gridCol w:w="1082"/>
         <w:gridCol w:w="2610"/>
       </w:tblGrid>
       <w:tr>
         <w:trPr/>
         <w:tc>
           <w:tcPr>
-            <w:tcW w:w="5490" w:type="dxa"/>
+            <w:tcW w:w="5488" w:type="dxa"/>
             <w:tcBorders>
               <w:top w:val="single" w:sz="6" w:space="0" w:color="808080"/>
               <w:start w:val="single" w:sz="6" w:space="0" w:color="808080"/>
@@ -4033,7 +5200,7 @@
         </w:tc>
         <w:tc>
           <w:tcPr>
-            <w:tcW w:w="1080" w:type="dxa"/>
+            <w:tcW w:w="1082" w:type="dxa"/>
             <w:tcBorders>
               <w:top w:val="single" w:sz="6" w:space="0" w:color="808080"/>
               <w:start w:val="single" w:sz="2" w:space="0" w:color="808080"/>
@@ -4094,7 +5261,7 @@
         <w:trPr/>
         <w:tc>
           <w:tcPr>
-            <w:tcW w:w="5490" w:type="dxa"/>
+            <w:tcW w:w="5488" w:type="dxa"/>
             <w:tcBorders>
               <w:start w:val="single" w:sz="6" w:space="0" w:color="808080"/>
               <w:bottom w:val="single" w:sz="2" w:space="0" w:color="808080"/>
@@ -4116,13 +5283,20 @@
                 <w:sz w:val="20"/>
                 <w:szCs w:val="20"/>
               </w:rPr>
-              <w:t>Prototype: technical viability of MS365-targeted QR/sign-up features</w:t>
-            </w:r>
-          </w:p>
-        </w:tc>
-        <w:tc>
-          <w:tcPr>
-            <w:tcW w:w="1080" w:type="dxa"/>
+              <w:t xml:space="preserve">Prototype: technical viability of </w:t>
+            </w:r>
+            <w:r>
+              <w:rPr>
+                <w:sz w:val="20"/>
+                <w:szCs w:val="20"/>
+              </w:rPr>
+              <w:t>filtering spreadsheet addition using nominatim / grist</w:t>
+            </w:r>
+          </w:p>
+        </w:tc>
+        <w:tc>
+          <w:tcPr>
+            <w:tcW w:w="1082" w:type="dxa"/>
             <w:tcBorders>
               <w:start w:val="single" w:sz="2" w:space="0" w:color="808080"/>
               <w:bottom w:val="single" w:sz="2" w:space="0" w:color="808080"/>
@@ -4181,7 +5355,7 @@
         <w:trPr/>
         <w:tc>
           <w:tcPr>
-            <w:tcW w:w="5490" w:type="dxa"/>
+            <w:tcW w:w="5488" w:type="dxa"/>
             <w:tcBorders>
               <w:start w:val="single" w:sz="6" w:space="0" w:color="808080"/>
               <w:bottom w:val="single" w:sz="2" w:space="0" w:color="808080"/>
@@ -4209,7 +5383,7 @@
         </w:tc>
         <w:tc>
           <w:tcPr>
-            <w:tcW w:w="1080" w:type="dxa"/>
+            <w:tcW w:w="1082" w:type="dxa"/>
             <w:tcBorders>
               <w:start w:val="single" w:sz="2" w:space="0" w:color="808080"/>
               <w:bottom w:val="single" w:sz="2" w:space="0" w:color="808080"/>
@@ -4268,7 +5442,7 @@
         <w:trPr/>
         <w:tc>
           <w:tcPr>
-            <w:tcW w:w="5490" w:type="dxa"/>
+            <w:tcW w:w="5488" w:type="dxa"/>
             <w:tcBorders>
               <w:start w:val="single" w:sz="6" w:space="0" w:color="808080"/>
               <w:bottom w:val="single" w:sz="6" w:space="0" w:color="808080"/>
@@ -4298,7 +5472,7 @@
         </w:tc>
         <w:tc>
           <w:tcPr>
-            <w:tcW w:w="1080" w:type="dxa"/>
+            <w:tcW w:w="1082" w:type="dxa"/>
             <w:tcBorders>
               <w:start w:val="single" w:sz="2" w:space="0" w:color="808080"/>
               <w:bottom w:val="single" w:sz="6" w:space="0" w:color="808080"/>
@@ -4410,7 +5584,7 @@
       <w:tblPr>
         <w:tblW w:w="9180" w:type="dxa"/>
         <w:jc w:val="start"/>
-        <w:tblInd w:w="-7" w:type="dxa"/>
+        <w:tblInd w:w="-6" w:type="dxa"/>
         <w:tblLayout w:type="fixed"/>
         <w:tblCellMar>
           <w:top w:w="90" w:type="dxa"/>
@@ -4732,7 +5906,7 @@
       <w:tblPr>
         <w:tblW w:w="5580" w:type="dxa"/>
         <w:jc w:val="start"/>
-        <w:tblInd w:w="-7" w:type="dxa"/>
+        <w:tblInd w:w="-6" w:type="dxa"/>
         <w:tblLayout w:type="fixed"/>
         <w:tblCellMar>
           <w:top w:w="90" w:type="dxa"/>
@@ -4742,14 +5916,14 @@
         </w:tblCellMar>
       </w:tblPr>
       <w:tblGrid>
-        <w:gridCol w:w="3510"/>
-        <w:gridCol w:w="2070"/>
+        <w:gridCol w:w="3509"/>
+        <w:gridCol w:w="2071"/>
       </w:tblGrid>
       <w:tr>
         <w:trPr/>
         <w:tc>
           <w:tcPr>
-            <w:tcW w:w="3510" w:type="dxa"/>
+            <w:tcW w:w="3509" w:type="dxa"/>
             <w:tcBorders>
               <w:top w:val="single" w:sz="6" w:space="0" w:color="808080"/>
               <w:start w:val="single" w:sz="6" w:space="0" w:color="808080"/>
@@ -4778,7 +5952,7 @@
         </w:tc>
         <w:tc>
           <w:tcPr>
-            <w:tcW w:w="2070" w:type="dxa"/>
+            <w:tcW w:w="2071" w:type="dxa"/>
             <w:tcBorders>
               <w:top w:val="single" w:sz="6" w:space="0" w:color="808080"/>
               <w:start w:val="single" w:sz="2" w:space="0" w:color="808080"/>
@@ -4810,7 +5984,7 @@
         <w:trPr/>
         <w:tc>
           <w:tcPr>
-            <w:tcW w:w="3510" w:type="dxa"/>
+            <w:tcW w:w="3509" w:type="dxa"/>
             <w:tcBorders>
               <w:start w:val="single" w:sz="6" w:space="0" w:color="808080"/>
               <w:bottom w:val="single" w:sz="2" w:space="0" w:color="808080"/>
@@ -4838,7 +6012,7 @@
         </w:tc>
         <w:tc>
           <w:tcPr>
-            <w:tcW w:w="2070" w:type="dxa"/>
+            <w:tcW w:w="2071" w:type="dxa"/>
             <w:tcBorders>
               <w:start w:val="single" w:sz="2" w:space="0" w:color="808080"/>
               <w:bottom w:val="single" w:sz="2" w:space="0" w:color="808080"/>
@@ -4869,7 +6043,7 @@
         <w:trPr/>
         <w:tc>
           <w:tcPr>
-            <w:tcW w:w="3510" w:type="dxa"/>
+            <w:tcW w:w="3509" w:type="dxa"/>
             <w:tcBorders>
               <w:start w:val="single" w:sz="6" w:space="0" w:color="808080"/>
               <w:bottom w:val="single" w:sz="6" w:space="0" w:color="808080"/>
@@ -4899,7 +6073,7 @@
         </w:tc>
         <w:tc>
           <w:tcPr>
-            <w:tcW w:w="2070" w:type="dxa"/>
+            <w:tcW w:w="2071" w:type="dxa"/>
             <w:tcBorders>
               <w:start w:val="single" w:sz="2" w:space="0" w:color="808080"/>
               <w:bottom w:val="single" w:sz="6" w:space="0" w:color="808080"/>
@@ -4971,7 +6145,7 @@
       <w:tblPr>
         <w:tblW w:w="6801" w:type="dxa"/>
         <w:jc w:val="start"/>
-        <w:tblInd w:w="-7" w:type="dxa"/>
+        <w:tblInd w:w="-6" w:type="dxa"/>
         <w:tblLayout w:type="fixed"/>
         <w:tblCellMar>
           <w:top w:w="90" w:type="dxa"/>
@@ -5409,8 +6583,9 @@
       </w:r>
     </w:p>
     <w:sectPr>
-      <w:headerReference w:type="default" r:id="rId5"/>
-      <w:headerReference w:type="first" r:id="rId6"/>
+      <w:headerReference w:type="even" r:id="rId5"/>
+      <w:headerReference w:type="default" r:id="rId6"/>
+      <w:headerReference w:type="first" r:id="rId7"/>
       <w:type w:val="nextPage"/>
       <w:pgSz w:w="11906" w:h="16838"/>
       <w:pgMar w:left="1134" w:right="567" w:gutter="0" w:header="0" w:top="567" w:footer="0" w:bottom="567"/>
@@ -5445,7 +6620,6 @@
       <w:keepNext w:val="false"/>
       <w:keepLines w:val="false"/>
       <w:widowControl/>
-      <w:pBdr/>
       <w:shd w:val="clear" w:fill="auto"/>
       <w:tabs>
         <w:tab w:val="clear" w:pos="720"/>
@@ -5503,7 +6677,6 @@
       <w:keepNext w:val="false"/>
       <w:keepLines w:val="false"/>
       <w:widowControl/>
-      <w:pBdr/>
       <w:shd w:val="clear" w:fill="auto"/>
       <w:tabs>
         <w:tab w:val="clear" w:pos="720"/>
@@ -5551,7 +6724,7 @@
                 </pic:nvPicPr>
                 <pic:blipFill>
                   <a:blip r:embed="rId1"/>
-                  <a:srcRect l="8026" t="33468" r="77696" b="0"/>
+                  <a:srcRect l="8025" t="33468" r="77677" b="0"/>
                   <a:stretch>
                     <a:fillRect/>
                   </a:stretch>
@@ -5578,13 +6751,53 @@
 
 <file path=word/header4.xml><?xml version="1.0" encoding="utf-8"?>
 <w:hdr xmlns:o="urn:schemas-microsoft-com:office:office" xmlns:r="http://schemas.openxmlformats.org/officeDocument/2006/relationships" xmlns:v="urn:schemas-microsoft-com:vml" xmlns:w="http://schemas.openxmlformats.org/wordprocessingml/2006/main" xmlns:w10="urn:schemas-microsoft-com:office:word" xmlns:wp="http://schemas.openxmlformats.org/drawingml/2006/wordprocessingDrawing" xmlns:pic="http://schemas.openxmlformats.org/drawingml/2006/picture" xmlns:wps="http://schemas.microsoft.com/office/word/2010/wordprocessingShape" xmlns:wpg="http://schemas.microsoft.com/office/word/2010/wordprocessingGroup" xmlns:mc="http://schemas.openxmlformats.org/markup-compatibility/2006" xmlns:wp14="http://schemas.microsoft.com/office/word/2010/wordprocessingDrawing" xmlns:w14="http://schemas.microsoft.com/office/word/2010/wordml" xmlns:w15="http://schemas.microsoft.com/office/word/2012/wordml" mc:Ignorable="w14 wp14 w15">
-  <w:p/>
+  <w:p>
+    <w:pPr>
+      <w:pStyle w:val="Header"/>
+      <w:rPr/>
+    </w:pPr>
+    <w:r>
+      <w:rPr/>
+    </w:r>
+  </w:p>
 </w:hdr>
 </file>
 
 <file path=word/header5.xml><?xml version="1.0" encoding="utf-8"?>
 <w:hdr xmlns:o="urn:schemas-microsoft-com:office:office" xmlns:r="http://schemas.openxmlformats.org/officeDocument/2006/relationships" xmlns:v="urn:schemas-microsoft-com:vml" xmlns:w="http://schemas.openxmlformats.org/wordprocessingml/2006/main" xmlns:w10="urn:schemas-microsoft-com:office:word" xmlns:wp="http://schemas.openxmlformats.org/drawingml/2006/wordprocessingDrawing" xmlns:pic="http://schemas.openxmlformats.org/drawingml/2006/picture" xmlns:wps="http://schemas.microsoft.com/office/word/2010/wordprocessingShape" xmlns:wpg="http://schemas.microsoft.com/office/word/2010/wordprocessingGroup" xmlns:mc="http://schemas.openxmlformats.org/markup-compatibility/2006" xmlns:wp14="http://schemas.microsoft.com/office/word/2010/wordprocessingDrawing" xmlns:w14="http://schemas.microsoft.com/office/word/2010/wordml" xmlns:w15="http://schemas.microsoft.com/office/word/2012/wordml" mc:Ignorable="w14 wp14 w15">
-  <w:p/>
+  <w:p>
+    <w:pPr>
+      <w:pStyle w:val="normal1"/>
+      <w:widowControl/>
+      <w:suppressAutoHyphens w:val="true"/>
+      <w:bidi w:val="0"/>
+      <w:spacing w:lineRule="auto" w:line="259" w:before="0" w:after="160"/>
+      <w:jc w:val="start"/>
+      <w:rPr/>
+    </w:pPr>
+    <w:r>
+      <w:rPr/>
+    </w:r>
+  </w:p>
+</w:hdr>
+</file>
+
+<file path=word/header6.xml><?xml version="1.0" encoding="utf-8"?>
+<w:hdr xmlns:o="urn:schemas-microsoft-com:office:office" xmlns:r="http://schemas.openxmlformats.org/officeDocument/2006/relationships" xmlns:v="urn:schemas-microsoft-com:vml" xmlns:w="http://schemas.openxmlformats.org/wordprocessingml/2006/main" xmlns:w10="urn:schemas-microsoft-com:office:word" xmlns:wp="http://schemas.openxmlformats.org/drawingml/2006/wordprocessingDrawing" xmlns:pic="http://schemas.openxmlformats.org/drawingml/2006/picture" xmlns:wps="http://schemas.microsoft.com/office/word/2010/wordprocessingShape" xmlns:wpg="http://schemas.microsoft.com/office/word/2010/wordprocessingGroup" xmlns:mc="http://schemas.openxmlformats.org/markup-compatibility/2006" xmlns:wp14="http://schemas.microsoft.com/office/word/2010/wordprocessingDrawing" xmlns:w14="http://schemas.microsoft.com/office/word/2010/wordml" xmlns:w15="http://schemas.microsoft.com/office/word/2012/wordml" mc:Ignorable="w14 wp14 w15">
+  <w:p>
+    <w:pPr>
+      <w:pStyle w:val="normal1"/>
+      <w:widowControl/>
+      <w:suppressAutoHyphens w:val="true"/>
+      <w:bidi w:val="0"/>
+      <w:spacing w:lineRule="auto" w:line="259" w:before="0" w:after="160"/>
+      <w:jc w:val="start"/>
+      <w:rPr/>
+    </w:pPr>
+    <w:r>
+      <w:rPr/>
+    </w:r>
+  </w:p>
 </w:hdr>
 </file>
 
@@ -5611,6 +6824,7 @@
     <w:rsid w:val="008e1a24"/>
     <w:pPr>
       <w:widowControl/>
+      <w:suppressAutoHyphens w:val="true"/>
       <w:bidi w:val="0"/>
       <w:spacing w:lineRule="auto" w:line="259" w:before="0" w:after="160"/>
       <w:jc w:val="start"/>
@@ -6191,6 +7405,7 @@
     <w:qFormat/>
     <w:pPr>
       <w:widowControl/>
+      <w:suppressAutoHyphens w:val="true"/>
       <w:bidi w:val="0"/>
       <w:spacing w:lineRule="auto" w:line="259" w:before="0" w:after="160"/>
       <w:jc w:val="start"/>
@@ -6422,6 +7637,19 @@
   </w:style>
   <w:style w:type="paragraph" w:styleId="TableHeading1">
     <w:name w:val="Table Heading1"/>
+    <w:basedOn w:val="TableContents"/>
+    <w:qFormat/>
+    <w:pPr>
+      <w:suppressLineNumbers/>
+      <w:jc w:val="center"/>
+    </w:pPr>
+    <w:rPr>
+      <w:b/>
+      <w:bCs/>
+    </w:rPr>
+  </w:style>
+  <w:style w:type="paragraph" w:styleId="TableHeading2">
+    <w:name w:val="Table Heading2"/>
     <w:basedOn w:val="TableContents"/>
     <w:qFormat/>
     <w:pPr>

</xml_diff>